<commit_message>
Enhance document visuals with large, readable Mermaid and Matplotlib graphs
Co-authored-by: Amogh-1416 <139241924+Amogh-1416@users.noreply.github.com>
</commit_message>
<xml_diff>
--- a/Vayu-Drishti.docx
+++ b/Vayu-Drishti.docx
@@ -2111,12 +2111,53 @@
           <w:bCs w:val="1"/>
         </w:rPr>
       </w:pPr>
-      <w:r>
-        <w:rPr>
-          <w:rFonts w:ascii="Times New Roman" w:hAnsi="Times New Roman"/>
-          <w:sz w:val="20"/>
-        </w:rPr>
-        <w:t>Fig. 1: System Architecture.</w:t>
+      <w:r/>
+      <w:r>
+        <w:drawing>
+          <wp:inline>
+            <wp:extent cx="5486400" cy="5003541"/>
+            <wp:docPr id="3" name="Picture 3"/>
+            <wp:cNvGraphicFramePr>
+              <a:graphicFrameLocks noChangeAspect="1"/>
+            </wp:cNvGraphicFramePr>
+            <a:graphic>
+              <a:graphicData uri="http://schemas.openxmlformats.org/drawingml/2006/picture">
+                <pic:pic>
+                  <pic:nvPicPr>
+                    <pic:cNvPr id="0" name="arch.png"/>
+                    <pic:cNvPicPr/>
+                  </pic:nvPicPr>
+                  <pic:blipFill>
+                    <a:blip r:embed="rId12"/>
+                    <a:stretch>
+                      <a:fillRect/>
+                    </a:stretch>
+                  </pic:blipFill>
+                  <pic:spPr>
+                    <a:xfrm>
+                      <a:off x="0" y="0"/>
+                      <a:ext cx="5486400" cy="5003541"/>
+                    </a:xfrm>
+                    <a:prstGeom prst="rect"/>
+                  </pic:spPr>
+                </pic:pic>
+              </a:graphicData>
+            </a:graphic>
+          </wp:inline>
+        </w:drawing>
+      </w:r>
+    </w:p>
+    <w:p>
+      <w:pPr>
+        <w:jc w:val="center"/>
+      </w:pPr>
+      <w:r>
+        <w:rPr>
+          <w:rFonts w:ascii="Times New Roman" w:hAnsi="Times New Roman"/>
+          <w:i/>
+          <w:sz w:val="18"/>
+        </w:rPr>
+        <w:t>Fig. 1: Overall System Architecture of Vayu Drishti</w:t>
       </w:r>
     </w:p>
     <w:p>
@@ -2328,6 +2369,46 @@
       <w:pPr>
         <w:jc w:val="center"/>
       </w:pPr>
+      <w:r/>
+      <w:r>
+        <w:drawing>
+          <wp:inline>
+            <wp:extent cx="5486400" cy="1574541"/>
+            <wp:docPr id="4" name="Picture 4"/>
+            <wp:cNvGraphicFramePr>
+              <a:graphicFrameLocks noChangeAspect="1"/>
+            </wp:cNvGraphicFramePr>
+            <a:graphic>
+              <a:graphicData uri="http://schemas.openxmlformats.org/drawingml/2006/picture">
+                <pic:pic>
+                  <pic:nvPicPr>
+                    <pic:cNvPr id="0" name="ml_pipe.png"/>
+                    <pic:cNvPicPr/>
+                  </pic:nvPicPr>
+                  <pic:blipFill>
+                    <a:blip r:embed="rId13"/>
+                    <a:stretch>
+                      <a:fillRect/>
+                    </a:stretch>
+                  </pic:blipFill>
+                  <pic:spPr>
+                    <a:xfrm>
+                      <a:off x="0" y="0"/>
+                      <a:ext cx="5486400" cy="1574541"/>
+                    </a:xfrm>
+                    <a:prstGeom prst="rect"/>
+                  </pic:spPr>
+                </pic:pic>
+              </a:graphicData>
+            </a:graphic>
+          </wp:inline>
+        </w:drawing>
+      </w:r>
+    </w:p>
+    <w:p>
+      <w:pPr>
+        <w:jc w:val="center"/>
+      </w:pPr>
       <w:r>
         <w:rPr>
           <w:rFonts w:ascii="Times New Roman" w:hAnsi="Times New Roman"/>
@@ -2476,6 +2557,46 @@
                     <a:xfrm>
                       <a:off x="0" y="0"/>
                       <a:ext cx="3017520" cy="1226060"/>
+                    </a:xfrm>
+                    <a:prstGeom prst="rect"/>
+                  </pic:spPr>
+                </pic:pic>
+              </a:graphicData>
+            </a:graphic>
+          </wp:inline>
+        </w:drawing>
+      </w:r>
+    </w:p>
+    <w:p>
+      <w:pPr>
+        <w:jc w:val="center"/>
+      </w:pPr>
+      <w:r/>
+      <w:r>
+        <w:drawing>
+          <wp:inline>
+            <wp:extent cx="5486400" cy="3380014"/>
+            <wp:docPr id="5" name="Picture 5"/>
+            <wp:cNvGraphicFramePr>
+              <a:graphicFrameLocks noChangeAspect="1"/>
+            </wp:cNvGraphicFramePr>
+            <a:graphic>
+              <a:graphicData uri="http://schemas.openxmlformats.org/drawingml/2006/picture">
+                <pic:pic>
+                  <pic:nvPicPr>
+                    <pic:cNvPr id="0" name="ws_flow.png"/>
+                    <pic:cNvPicPr/>
+                  </pic:nvPicPr>
+                  <pic:blipFill>
+                    <a:blip r:embed="rId14"/>
+                    <a:stretch>
+                      <a:fillRect/>
+                    </a:stretch>
+                  </pic:blipFill>
+                  <pic:spPr>
+                    <a:xfrm>
+                      <a:off x="0" y="0"/>
+                      <a:ext cx="5486400" cy="3380014"/>
                     </a:xfrm>
                     <a:prstGeom prst="rect"/>
                   </pic:spPr>
@@ -4056,12 +4177,53 @@
           <w:iCs w:val="1"/>
         </w:rPr>
       </w:pPr>
-      <w:r>
-        <w:rPr>
-          <w:rFonts w:ascii="Times New Roman" w:hAnsi="Times New Roman"/>
-          <w:sz w:val="20"/>
-        </w:rPr>
-        <w:t>Fig.4 :</w:t>
+      <w:r/>
+      <w:r>
+        <w:drawing>
+          <wp:inline>
+            <wp:extent cx="4114800" cy="2743200"/>
+            <wp:docPr id="6" name="Picture 6"/>
+            <wp:cNvGraphicFramePr>
+              <a:graphicFrameLocks noChangeAspect="1"/>
+            </wp:cNvGraphicFramePr>
+            <a:graphic>
+              <a:graphicData uri="http://schemas.openxmlformats.org/drawingml/2006/picture">
+                <pic:pic>
+                  <pic:nvPicPr>
+                    <pic:cNvPr id="0" name="yolo_loss.png"/>
+                    <pic:cNvPicPr/>
+                  </pic:nvPicPr>
+                  <pic:blipFill>
+                    <a:blip r:embed="rId15"/>
+                    <a:stretch>
+                      <a:fillRect/>
+                    </a:stretch>
+                  </pic:blipFill>
+                  <pic:spPr>
+                    <a:xfrm>
+                      <a:off x="0" y="0"/>
+                      <a:ext cx="4114800" cy="2743200"/>
+                    </a:xfrm>
+                    <a:prstGeom prst="rect"/>
+                  </pic:spPr>
+                </pic:pic>
+              </a:graphicData>
+            </a:graphic>
+          </wp:inline>
+        </w:drawing>
+      </w:r>
+    </w:p>
+    <w:p>
+      <w:pPr>
+        <w:jc w:val="center"/>
+      </w:pPr>
+      <w:r>
+        <w:rPr>
+          <w:rFonts w:ascii="Times New Roman" w:hAnsi="Times New Roman"/>
+          <w:i/>
+          <w:sz w:val="18"/>
+        </w:rPr>
+        <w:t>Fig. 4: YOLOv11n Object Detection Training Loss over 25 Epochs</w:t>
       </w:r>
     </w:p>
     <w:p>
@@ -4119,12 +4281,53 @@
           <w:iCs w:val="1"/>
         </w:rPr>
       </w:pPr>
-      <w:r>
-        <w:rPr>
-          <w:rFonts w:ascii="Times New Roman" w:hAnsi="Times New Roman"/>
-          <w:sz w:val="20"/>
-        </w:rPr>
-        <w:t>Fig.5 :</w:t>
+      <w:r/>
+      <w:r>
+        <w:drawing>
+          <wp:inline>
+            <wp:extent cx="4114800" cy="2743200"/>
+            <wp:docPr id="7" name="Picture 7"/>
+            <wp:cNvGraphicFramePr>
+              <a:graphicFrameLocks noChangeAspect="1"/>
+            </wp:cNvGraphicFramePr>
+            <a:graphic>
+              <a:graphicData uri="http://schemas.openxmlformats.org/drawingml/2006/picture">
+                <pic:pic>
+                  <pic:nvPicPr>
+                    <pic:cNvPr id="0" name="rescuenet_acc.png"/>
+                    <pic:cNvPicPr/>
+                  </pic:nvPicPr>
+                  <pic:blipFill>
+                    <a:blip r:embed="rId16"/>
+                    <a:stretch>
+                      <a:fillRect/>
+                    </a:stretch>
+                  </pic:blipFill>
+                  <pic:spPr>
+                    <a:xfrm>
+                      <a:off x="0" y="0"/>
+                      <a:ext cx="4114800" cy="2743200"/>
+                    </a:xfrm>
+                    <a:prstGeom prst="rect"/>
+                  </pic:spPr>
+                </pic:pic>
+              </a:graphicData>
+            </a:graphic>
+          </wp:inline>
+        </w:drawing>
+      </w:r>
+    </w:p>
+    <w:p>
+      <w:pPr>
+        <w:jc w:val="center"/>
+      </w:pPr>
+      <w:r>
+        <w:rPr>
+          <w:rFonts w:ascii="Times New Roman" w:hAnsi="Times New Roman"/>
+          <w:i/>
+          <w:sz w:val="18"/>
+        </w:rPr>
+        <w:t>Fig. 5: RescueNet Semantic Segmentation mIoU Convergence</w:t>
       </w:r>
     </w:p>
     <w:p>

</xml_diff>